<commit_message>
Certificate Viewer added to portfolio
</commit_message>
<xml_diff>
--- a/Portfolio_Concept_Doc.docx
+++ b/Portfolio_Concept_Doc.docx
@@ -32,7 +32,39 @@
           <w:sz w:val="36"/>
           <w:szCs w:val="36"/>
         </w:rPr>
-        <w:t xml:space="preserve"> Portfolio Concept: JEAN PIERRE JOSEPH — ENGINEERING THE FUTURE</w:t>
+        <w:t xml:space="preserve"> Portfolio Concept</w:t>
+      </w:r>
+      <w:r>
+        <w:rPr>
+          <w:rFonts w:ascii="Times New Roman" w:eastAsia="Times New Roman" w:hAnsi="Times New Roman" w:cs="Times New Roman"/>
+          <w:b/>
+          <w:bCs/>
+          <w:sz w:val="36"/>
+          <w:szCs w:val="36"/>
+        </w:rPr>
+        <w:t xml:space="preserve"> (Platform </w:t>
+      </w:r>
+      <w:bookmarkStart w:id="0" w:name="_GoBack"/>
+      <w:bookmarkEnd w:id="0"/>
+      <w:r>
+        <w:rPr>
+          <w:rFonts w:ascii="Times New Roman" w:eastAsia="Times New Roman" w:hAnsi="Times New Roman" w:cs="Times New Roman"/>
+          <w:b/>
+          <w:bCs/>
+          <w:sz w:val="36"/>
+          <w:szCs w:val="36"/>
+        </w:rPr>
+        <w:t>PortAncest)</w:t>
+      </w:r>
+      <w:r>
+        <w:rPr>
+          <w:rFonts w:ascii="Times New Roman" w:eastAsia="Times New Roman" w:hAnsi="Times New Roman" w:cs="Times New Roman"/>
+          <w:b/>
+          <w:bCs/>
+          <w:sz w:val="36"/>
+          <w:szCs w:val="36"/>
+        </w:rPr>
+        <w:t>: JEAN PIERRE JOSEPH — ENGINEERING THE FUTURE</w:t>
       </w:r>
     </w:p>
     <w:p>
@@ -31698,8 +31730,6 @@
           <w:szCs w:val="24"/>
         </w:rPr>
       </w:pPr>
-      <w:bookmarkStart w:id="0" w:name="_GoBack"/>
-      <w:bookmarkEnd w:id="0"/>
       <w:r>
         <w:rPr>
           <w:rFonts w:ascii="Times New Roman" w:eastAsia="Times New Roman" w:hAnsi="Times New Roman" w:cs="Times New Roman"/>

</xml_diff>